<commit_message>
aula 26/08 p3 - pilhas e filas
</commit_message>
<xml_diff>
--- a/3semestre/designsoftware/RA1-doc.docx
+++ b/3semestre/designsoftware/RA1-doc.docx
@@ -184,7 +184,16 @@
           <w:lang w:eastAsia="pt-BR"/>
           <w14:ligatures w14:val="none"/>
         </w:rPr>
-        <w:t xml:space="preserve"> (Nomes dos integrantes da equipe)</w:t>
+        <w:t xml:space="preserve"> </w:t>
+      </w:r>
+      <w:r>
+        <w:rPr>
+          <w:rFonts w:ascii="Arial" w:eastAsia="Times New Roman" w:hAnsi="Arial" w:cs="Arial"/>
+          <w:kern w:val="0"/>
+          <w:lang w:eastAsia="pt-BR"/>
+          <w14:ligatures w14:val="none"/>
+        </w:rPr>
+        <w:t>Guilherme Reis, Guilherme Marafon, Nicolas Lobo, Vinicius Trevisan</w:t>
       </w:r>
     </w:p>
     <w:p>
@@ -612,19 +621,35 @@
           <w:lang w:eastAsia="pt-BR"/>
           <w14:ligatures w14:val="none"/>
         </w:rPr>
-        <w:t xml:space="preserve"> Instrutores devem poder </w:t>
-      </w:r>
-      <w:proofErr w:type="gramStart"/>
-      <w:r>
-        <w:rPr>
-          <w:rFonts w:ascii="Arial" w:eastAsia="Times New Roman" w:hAnsi="Arial" w:cs="Arial"/>
-          <w:kern w:val="0"/>
-          <w:lang w:eastAsia="pt-BR"/>
-          <w14:ligatures w14:val="none"/>
-        </w:rPr>
-        <w:t>criar novos</w:t>
-      </w:r>
-      <w:proofErr w:type="gramEnd"/>
+        <w:t xml:space="preserve"> </w:t>
+      </w:r>
+      <w:r>
+        <w:rPr>
+          <w:rFonts w:ascii="Arial" w:eastAsia="Times New Roman" w:hAnsi="Arial" w:cs="Arial"/>
+          <w:kern w:val="0"/>
+          <w:lang w:eastAsia="pt-BR"/>
+          <w14:ligatures w14:val="none"/>
+        </w:rPr>
+        <w:t xml:space="preserve">O sistema deve permitir que instrutores </w:t>
+      </w:r>
+      <w:r>
+        <w:rPr>
+          <w:rFonts w:ascii="Arial" w:eastAsia="Times New Roman" w:hAnsi="Arial" w:cs="Arial"/>
+          <w:kern w:val="0"/>
+          <w:lang w:eastAsia="pt-BR"/>
+          <w14:ligatures w14:val="none"/>
+        </w:rPr>
+        <w:t xml:space="preserve">possam </w:t>
+      </w:r>
+      <w:r>
+        <w:rPr>
+          <w:rFonts w:ascii="Arial" w:eastAsia="Times New Roman" w:hAnsi="Arial" w:cs="Arial"/>
+          <w:kern w:val="0"/>
+          <w:lang w:eastAsia="pt-BR"/>
+          <w14:ligatures w14:val="none"/>
+        </w:rPr>
+        <w:t>criar</w:t>
+      </w:r>
       <w:r>
         <w:rPr>
           <w:rFonts w:ascii="Arial" w:eastAsia="Times New Roman" w:hAnsi="Arial" w:cs="Arial"/>
@@ -667,7 +692,25 @@
           <w:lang w:eastAsia="pt-BR"/>
           <w14:ligatures w14:val="none"/>
         </w:rPr>
-        <w:t xml:space="preserve"> Instrutores devem poder organizar o conteúdo do curso em módulos e aulas.</w:t>
+        <w:t xml:space="preserve"> </w:t>
+      </w:r>
+      <w:r>
+        <w:rPr>
+          <w:rFonts w:ascii="Arial" w:eastAsia="Times New Roman" w:hAnsi="Arial" w:cs="Arial"/>
+          <w:kern w:val="0"/>
+          <w:lang w:eastAsia="pt-BR"/>
+          <w14:ligatures w14:val="none"/>
+        </w:rPr>
+        <w:t xml:space="preserve">O sistema deve permitir que instrutores </w:t>
+      </w:r>
+      <w:r>
+        <w:rPr>
+          <w:rFonts w:ascii="Arial" w:eastAsia="Times New Roman" w:hAnsi="Arial" w:cs="Arial"/>
+          <w:kern w:val="0"/>
+          <w:lang w:eastAsia="pt-BR"/>
+          <w14:ligatures w14:val="none"/>
+        </w:rPr>
+        <w:t>organizar o conteúdo do curso em módulos e aulas.</w:t>
       </w:r>
     </w:p>
     <w:p>
@@ -703,7 +746,34 @@
           <w:lang w:eastAsia="pt-BR"/>
           <w14:ligatures w14:val="none"/>
         </w:rPr>
-        <w:t xml:space="preserve"> Instrutores devem poder fazer upload de videoaulas para suas lições.</w:t>
+        <w:t xml:space="preserve"> </w:t>
+      </w:r>
+      <w:r>
+        <w:rPr>
+          <w:rFonts w:ascii="Arial" w:eastAsia="Times New Roman" w:hAnsi="Arial" w:cs="Arial"/>
+          <w:kern w:val="0"/>
+          <w:lang w:eastAsia="pt-BR"/>
+          <w14:ligatures w14:val="none"/>
+        </w:rPr>
+        <w:t xml:space="preserve">O sistema deve permitir que instrutores </w:t>
+      </w:r>
+      <w:r>
+        <w:rPr>
+          <w:rFonts w:ascii="Arial" w:eastAsia="Times New Roman" w:hAnsi="Arial" w:cs="Arial"/>
+          <w:kern w:val="0"/>
+          <w:lang w:eastAsia="pt-BR"/>
+          <w14:ligatures w14:val="none"/>
+        </w:rPr>
+        <w:t xml:space="preserve">possam </w:t>
+      </w:r>
+      <w:r>
+        <w:rPr>
+          <w:rFonts w:ascii="Arial" w:eastAsia="Times New Roman" w:hAnsi="Arial" w:cs="Arial"/>
+          <w:kern w:val="0"/>
+          <w:lang w:eastAsia="pt-BR"/>
+          <w14:ligatures w14:val="none"/>
+        </w:rPr>
+        <w:t>fazer upload de videoaulas para suas lições.</w:t>
       </w:r>
     </w:p>
     <w:p>
@@ -738,7 +808,43 @@
           <w:lang w:eastAsia="pt-BR"/>
           <w14:ligatures w14:val="none"/>
         </w:rPr>
-        <w:t xml:space="preserve"> Instrutores devem poder anexar arquivos (</w:t>
+        <w:t xml:space="preserve"> </w:t>
+      </w:r>
+      <w:r>
+        <w:rPr>
+          <w:rFonts w:ascii="Arial" w:eastAsia="Times New Roman" w:hAnsi="Arial" w:cs="Arial"/>
+          <w:kern w:val="0"/>
+          <w:lang w:eastAsia="pt-BR"/>
+          <w14:ligatures w14:val="none"/>
+        </w:rPr>
+        <w:t>O sistema deve permitir que instrutores</w:t>
+      </w:r>
+      <w:r>
+        <w:rPr>
+          <w:rFonts w:ascii="Arial" w:eastAsia="Times New Roman" w:hAnsi="Arial" w:cs="Arial"/>
+          <w:kern w:val="0"/>
+          <w:lang w:eastAsia="pt-BR"/>
+          <w14:ligatures w14:val="none"/>
+        </w:rPr>
+        <w:t xml:space="preserve"> </w:t>
+      </w:r>
+      <w:r>
+        <w:rPr>
+          <w:rFonts w:ascii="Arial" w:eastAsia="Times New Roman" w:hAnsi="Arial" w:cs="Arial"/>
+          <w:kern w:val="0"/>
+          <w:lang w:eastAsia="pt-BR"/>
+          <w14:ligatures w14:val="none"/>
+        </w:rPr>
+        <w:t xml:space="preserve">possam </w:t>
+      </w:r>
+      <w:r>
+        <w:rPr>
+          <w:rFonts w:ascii="Arial" w:eastAsia="Times New Roman" w:hAnsi="Arial" w:cs="Arial"/>
+          <w:kern w:val="0"/>
+          <w:lang w:eastAsia="pt-BR"/>
+          <w14:ligatures w14:val="none"/>
+        </w:rPr>
+        <w:t>anexar arquivos (</w:t>
       </w:r>
       <w:proofErr w:type="spellStart"/>
       <w:r>
@@ -760,17 +866,15 @@
         </w:rPr>
         <w:t xml:space="preserve">, </w:t>
       </w:r>
-      <w:proofErr w:type="gramStart"/>
-      <w:r>
-        <w:rPr>
-          <w:rFonts w:ascii="Arial" w:eastAsia="Times New Roman" w:hAnsi="Arial" w:cs="Arial"/>
-          <w:kern w:val="0"/>
-          <w:lang w:eastAsia="pt-BR"/>
-          <w14:ligatures w14:val="none"/>
-        </w:rPr>
-        <w:t>planilhas, etc.</w:t>
-      </w:r>
-      <w:proofErr w:type="gramEnd"/>
+      <w:r>
+        <w:rPr>
+          <w:rFonts w:ascii="Arial" w:eastAsia="Times New Roman" w:hAnsi="Arial" w:cs="Arial"/>
+          <w:kern w:val="0"/>
+          <w:lang w:eastAsia="pt-BR"/>
+          <w14:ligatures w14:val="none"/>
+        </w:rPr>
+        <w:t>planilhas etc.</w:t>
+      </w:r>
       <w:r>
         <w:rPr>
           <w:rFonts w:ascii="Arial" w:eastAsia="Times New Roman" w:hAnsi="Arial" w:cs="Arial"/>
@@ -813,7 +917,34 @@
           <w:lang w:eastAsia="pt-BR"/>
           <w14:ligatures w14:val="none"/>
         </w:rPr>
-        <w:t xml:space="preserve"> Instrutores devem poder criar questionários (avaliações) com perguntas de múltipla escolha.</w:t>
+        <w:t xml:space="preserve"> </w:t>
+      </w:r>
+      <w:r>
+        <w:rPr>
+          <w:rFonts w:ascii="Arial" w:eastAsia="Times New Roman" w:hAnsi="Arial" w:cs="Arial"/>
+          <w:kern w:val="0"/>
+          <w:lang w:eastAsia="pt-BR"/>
+          <w14:ligatures w14:val="none"/>
+        </w:rPr>
+        <w:t xml:space="preserve">O sistema deve permitir que instrutores </w:t>
+      </w:r>
+      <w:r>
+        <w:rPr>
+          <w:rFonts w:ascii="Arial" w:eastAsia="Times New Roman" w:hAnsi="Arial" w:cs="Arial"/>
+          <w:kern w:val="0"/>
+          <w:lang w:eastAsia="pt-BR"/>
+          <w14:ligatures w14:val="none"/>
+        </w:rPr>
+        <w:t xml:space="preserve">possam </w:t>
+      </w:r>
+      <w:r>
+        <w:rPr>
+          <w:rFonts w:ascii="Arial" w:eastAsia="Times New Roman" w:hAnsi="Arial" w:cs="Arial"/>
+          <w:kern w:val="0"/>
+          <w:lang w:eastAsia="pt-BR"/>
+          <w14:ligatures w14:val="none"/>
+        </w:rPr>
+        <w:t>criar questionários (avaliações) com perguntas de múltipla escolha.</w:t>
       </w:r>
     </w:p>
     <w:p>
@@ -848,19 +979,44 @@
           <w:lang w:eastAsia="pt-BR"/>
           <w14:ligatures w14:val="none"/>
         </w:rPr>
-        <w:t xml:space="preserve"> Instrutores devem poder publicar ou </w:t>
-      </w:r>
-      <w:proofErr w:type="spellStart"/>
-      <w:r>
-        <w:rPr>
-          <w:rFonts w:ascii="Arial" w:eastAsia="Times New Roman" w:hAnsi="Arial" w:cs="Arial"/>
-          <w:kern w:val="0"/>
-          <w:lang w:eastAsia="pt-BR"/>
-          <w14:ligatures w14:val="none"/>
-        </w:rPr>
-        <w:t>despublicar</w:t>
-      </w:r>
-      <w:proofErr w:type="spellEnd"/>
+        <w:t xml:space="preserve"> </w:t>
+      </w:r>
+      <w:r>
+        <w:rPr>
+          <w:rFonts w:ascii="Arial" w:eastAsia="Times New Roman" w:hAnsi="Arial" w:cs="Arial"/>
+          <w:kern w:val="0"/>
+          <w:lang w:eastAsia="pt-BR"/>
+          <w14:ligatures w14:val="none"/>
+        </w:rPr>
+        <w:t xml:space="preserve">O sistema deve permitir que instrutores </w:t>
+      </w:r>
+      <w:r>
+        <w:rPr>
+          <w:rFonts w:ascii="Arial" w:eastAsia="Times New Roman" w:hAnsi="Arial" w:cs="Arial"/>
+          <w:kern w:val="0"/>
+          <w:lang w:eastAsia="pt-BR"/>
+          <w14:ligatures w14:val="none"/>
+        </w:rPr>
+        <w:t xml:space="preserve">possam </w:t>
+      </w:r>
+      <w:r>
+        <w:rPr>
+          <w:rFonts w:ascii="Arial" w:eastAsia="Times New Roman" w:hAnsi="Arial" w:cs="Arial"/>
+          <w:kern w:val="0"/>
+          <w:lang w:eastAsia="pt-BR"/>
+          <w14:ligatures w14:val="none"/>
+        </w:rPr>
+        <w:t xml:space="preserve">publicar ou </w:t>
+      </w:r>
+      <w:r>
+        <w:rPr>
+          <w:rFonts w:ascii="Arial" w:eastAsia="Times New Roman" w:hAnsi="Arial" w:cs="Arial"/>
+          <w:kern w:val="0"/>
+          <w:lang w:eastAsia="pt-BR"/>
+          <w14:ligatures w14:val="none"/>
+        </w:rPr>
+        <w:t>remover</w:t>
+      </w:r>
       <w:r>
         <w:rPr>
           <w:rFonts w:ascii="Arial" w:eastAsia="Times New Roman" w:hAnsi="Arial" w:cs="Arial"/>
@@ -903,7 +1059,52 @@
           <w:lang w:eastAsia="pt-BR"/>
           <w14:ligatures w14:val="none"/>
         </w:rPr>
-        <w:t xml:space="preserve"> Instrutores devem poder visualizar a lista de alunos matriculados em seus cursos.</w:t>
+        <w:t xml:space="preserve"> </w:t>
+      </w:r>
+      <w:r>
+        <w:rPr>
+          <w:rFonts w:ascii="Arial" w:eastAsia="Times New Roman" w:hAnsi="Arial" w:cs="Arial"/>
+          <w:kern w:val="0"/>
+          <w:lang w:eastAsia="pt-BR"/>
+          <w14:ligatures w14:val="none"/>
+        </w:rPr>
+        <w:t xml:space="preserve">O sistema deve permitir que </w:t>
+      </w:r>
+      <w:r>
+        <w:rPr>
+          <w:rFonts w:ascii="Arial" w:eastAsia="Times New Roman" w:hAnsi="Arial" w:cs="Arial"/>
+          <w:kern w:val="0"/>
+          <w:lang w:eastAsia="pt-BR"/>
+          <w14:ligatures w14:val="none"/>
+        </w:rPr>
+        <w:t>instrutores</w:t>
+      </w:r>
+      <w:r>
+        <w:rPr>
+          <w:rFonts w:ascii="Arial" w:eastAsia="Times New Roman" w:hAnsi="Arial" w:cs="Arial"/>
+          <w:kern w:val="0"/>
+          <w:lang w:eastAsia="pt-BR"/>
+          <w14:ligatures w14:val="none"/>
+        </w:rPr>
+        <w:t xml:space="preserve"> possam</w:t>
+      </w:r>
+      <w:r>
+        <w:rPr>
+          <w:rFonts w:ascii="Arial" w:eastAsia="Times New Roman" w:hAnsi="Arial" w:cs="Arial"/>
+          <w:kern w:val="0"/>
+          <w:lang w:eastAsia="pt-BR"/>
+          <w14:ligatures w14:val="none"/>
+        </w:rPr>
+        <w:t xml:space="preserve"> </w:t>
+      </w:r>
+      <w:r>
+        <w:rPr>
+          <w:rFonts w:ascii="Arial" w:eastAsia="Times New Roman" w:hAnsi="Arial" w:cs="Arial"/>
+          <w:kern w:val="0"/>
+          <w:lang w:eastAsia="pt-BR"/>
+          <w14:ligatures w14:val="none"/>
+        </w:rPr>
+        <w:t>visualizar a lista de alunos matriculados em seus cursos.</w:t>
       </w:r>
     </w:p>
     <w:p>
@@ -960,7 +1161,34 @@
           <w:lang w:eastAsia="pt-BR"/>
           <w14:ligatures w14:val="none"/>
         </w:rPr>
-        <w:t xml:space="preserve"> Alunos devem poder pesquisar e filtrar cursos por categoria ou palavra-chave.</w:t>
+        <w:t xml:space="preserve"> </w:t>
+      </w:r>
+      <w:r>
+        <w:rPr>
+          <w:rFonts w:ascii="Arial" w:eastAsia="Times New Roman" w:hAnsi="Arial" w:cs="Arial"/>
+          <w:kern w:val="0"/>
+          <w:lang w:eastAsia="pt-BR"/>
+          <w14:ligatures w14:val="none"/>
+        </w:rPr>
+        <w:t>O sistema deve permitir que alunos possam</w:t>
+      </w:r>
+      <w:r>
+        <w:rPr>
+          <w:rFonts w:ascii="Arial" w:eastAsia="Times New Roman" w:hAnsi="Arial" w:cs="Arial"/>
+          <w:kern w:val="0"/>
+          <w:lang w:eastAsia="pt-BR"/>
+          <w14:ligatures w14:val="none"/>
+        </w:rPr>
+        <w:t xml:space="preserve"> </w:t>
+      </w:r>
+      <w:r>
+        <w:rPr>
+          <w:rFonts w:ascii="Arial" w:eastAsia="Times New Roman" w:hAnsi="Arial" w:cs="Arial"/>
+          <w:kern w:val="0"/>
+          <w:lang w:eastAsia="pt-BR"/>
+          <w14:ligatures w14:val="none"/>
+        </w:rPr>
+        <w:t>pesquisar e filtrar cursos por categoria ou palavra-chave.</w:t>
       </w:r>
     </w:p>
     <w:p>
@@ -995,7 +1223,34 @@
           <w:lang w:eastAsia="pt-BR"/>
           <w14:ligatures w14:val="none"/>
         </w:rPr>
-        <w:t xml:space="preserve"> Alunos devem poder visualizar a página de detalhes de um curso antes de se matricularem.</w:t>
+        <w:t xml:space="preserve"> </w:t>
+      </w:r>
+      <w:r>
+        <w:rPr>
+          <w:rFonts w:ascii="Arial" w:eastAsia="Times New Roman" w:hAnsi="Arial" w:cs="Arial"/>
+          <w:kern w:val="0"/>
+          <w:lang w:eastAsia="pt-BR"/>
+          <w14:ligatures w14:val="none"/>
+        </w:rPr>
+        <w:t>O sistema deve permitir que alunos possam</w:t>
+      </w:r>
+      <w:r>
+        <w:rPr>
+          <w:rFonts w:ascii="Arial" w:eastAsia="Times New Roman" w:hAnsi="Arial" w:cs="Arial"/>
+          <w:kern w:val="0"/>
+          <w:lang w:eastAsia="pt-BR"/>
+          <w14:ligatures w14:val="none"/>
+        </w:rPr>
+        <w:t xml:space="preserve"> </w:t>
+      </w:r>
+      <w:r>
+        <w:rPr>
+          <w:rFonts w:ascii="Arial" w:eastAsia="Times New Roman" w:hAnsi="Arial" w:cs="Arial"/>
+          <w:kern w:val="0"/>
+          <w:lang w:eastAsia="pt-BR"/>
+          <w14:ligatures w14:val="none"/>
+        </w:rPr>
+        <w:t>visualizar a página de detalhes de um curso antes de se matricularem.</w:t>
       </w:r>
     </w:p>
     <w:p>
@@ -1030,7 +1285,34 @@
           <w:lang w:eastAsia="pt-BR"/>
           <w14:ligatures w14:val="none"/>
         </w:rPr>
-        <w:t xml:space="preserve"> Alunos devem poder se matricular em um curso através de um processo de pagamento.</w:t>
+        <w:t xml:space="preserve"> </w:t>
+      </w:r>
+      <w:r>
+        <w:rPr>
+          <w:rFonts w:ascii="Arial" w:eastAsia="Times New Roman" w:hAnsi="Arial" w:cs="Arial"/>
+          <w:kern w:val="0"/>
+          <w:lang w:eastAsia="pt-BR"/>
+          <w14:ligatures w14:val="none"/>
+        </w:rPr>
+        <w:t>O sistema deve permitir que alunos possam</w:t>
+      </w:r>
+      <w:r>
+        <w:rPr>
+          <w:rFonts w:ascii="Arial" w:eastAsia="Times New Roman" w:hAnsi="Arial" w:cs="Arial"/>
+          <w:kern w:val="0"/>
+          <w:lang w:eastAsia="pt-BR"/>
+          <w14:ligatures w14:val="none"/>
+        </w:rPr>
+        <w:t xml:space="preserve"> </w:t>
+      </w:r>
+      <w:r>
+        <w:rPr>
+          <w:rFonts w:ascii="Arial" w:eastAsia="Times New Roman" w:hAnsi="Arial" w:cs="Arial"/>
+          <w:kern w:val="0"/>
+          <w:lang w:eastAsia="pt-BR"/>
+          <w14:ligatures w14:val="none"/>
+        </w:rPr>
+        <w:t>se matricular em um curso através de um processo de pagamento.</w:t>
       </w:r>
     </w:p>
     <w:p>
@@ -1065,7 +1347,34 @@
           <w:lang w:eastAsia="pt-BR"/>
           <w14:ligatures w14:val="none"/>
         </w:rPr>
-        <w:t xml:space="preserve"> Alunos devem poder assistir às videoaulas em um player integrado à plataforma.</w:t>
+        <w:t xml:space="preserve"> </w:t>
+      </w:r>
+      <w:r>
+        <w:rPr>
+          <w:rFonts w:ascii="Arial" w:eastAsia="Times New Roman" w:hAnsi="Arial" w:cs="Arial"/>
+          <w:kern w:val="0"/>
+          <w:lang w:eastAsia="pt-BR"/>
+          <w14:ligatures w14:val="none"/>
+        </w:rPr>
+        <w:t>O sistema deve permitir que alunos possam</w:t>
+      </w:r>
+      <w:r>
+        <w:rPr>
+          <w:rFonts w:ascii="Arial" w:eastAsia="Times New Roman" w:hAnsi="Arial" w:cs="Arial"/>
+          <w:kern w:val="0"/>
+          <w:lang w:eastAsia="pt-BR"/>
+          <w14:ligatures w14:val="none"/>
+        </w:rPr>
+        <w:t xml:space="preserve"> </w:t>
+      </w:r>
+      <w:r>
+        <w:rPr>
+          <w:rFonts w:ascii="Arial" w:eastAsia="Times New Roman" w:hAnsi="Arial" w:cs="Arial"/>
+          <w:kern w:val="0"/>
+          <w:lang w:eastAsia="pt-BR"/>
+          <w14:ligatures w14:val="none"/>
+        </w:rPr>
+        <w:t>assistir às videoaulas em um player integrado à plataforma.</w:t>
       </w:r>
     </w:p>
     <w:p>
@@ -1100,7 +1409,25 @@
           <w:lang w:eastAsia="pt-BR"/>
           <w14:ligatures w14:val="none"/>
         </w:rPr>
-        <w:t xml:space="preserve"> Alunos devem poder marcar aulas como concluídas para acompanhar seu progresso.</w:t>
+        <w:t xml:space="preserve"> </w:t>
+      </w:r>
+      <w:r>
+        <w:rPr>
+          <w:rFonts w:ascii="Arial" w:eastAsia="Times New Roman" w:hAnsi="Arial" w:cs="Arial"/>
+          <w:kern w:val="0"/>
+          <w:lang w:eastAsia="pt-BR"/>
+          <w14:ligatures w14:val="none"/>
+        </w:rPr>
+        <w:t>O sistema deve permitir que alunos possam</w:t>
+      </w:r>
+      <w:r>
+        <w:rPr>
+          <w:rFonts w:ascii="Arial" w:eastAsia="Times New Roman" w:hAnsi="Arial" w:cs="Arial"/>
+          <w:kern w:val="0"/>
+          <w:lang w:eastAsia="pt-BR"/>
+          <w14:ligatures w14:val="none"/>
+        </w:rPr>
+        <w:t xml:space="preserve"> marcar aulas como concluídas para acompanhar seu progresso.</w:t>
       </w:r>
     </w:p>
     <w:p>
@@ -1135,7 +1462,43 @@
           <w:lang w:eastAsia="pt-BR"/>
           <w14:ligatures w14:val="none"/>
         </w:rPr>
-        <w:t xml:space="preserve"> Alunos devem poder responder aos questionários e ver sua pontuação final.</w:t>
+        <w:t xml:space="preserve"> </w:t>
+      </w:r>
+      <w:r>
+        <w:rPr>
+          <w:rFonts w:ascii="Arial" w:eastAsia="Times New Roman" w:hAnsi="Arial" w:cs="Arial"/>
+          <w:kern w:val="0"/>
+          <w:lang w:eastAsia="pt-BR"/>
+          <w14:ligatures w14:val="none"/>
+        </w:rPr>
+        <w:t>O sistema deve permitir que a</w:t>
+      </w:r>
+      <w:r>
+        <w:rPr>
+          <w:rFonts w:ascii="Arial" w:eastAsia="Times New Roman" w:hAnsi="Arial" w:cs="Arial"/>
+          <w:kern w:val="0"/>
+          <w:lang w:eastAsia="pt-BR"/>
+          <w14:ligatures w14:val="none"/>
+        </w:rPr>
+        <w:t>luno</w:t>
+      </w:r>
+      <w:r>
+        <w:rPr>
+          <w:rFonts w:ascii="Arial" w:eastAsia="Times New Roman" w:hAnsi="Arial" w:cs="Arial"/>
+          <w:kern w:val="0"/>
+          <w:lang w:eastAsia="pt-BR"/>
+          <w14:ligatures w14:val="none"/>
+        </w:rPr>
+        <w:t xml:space="preserve"> possam </w:t>
+      </w:r>
+      <w:r>
+        <w:rPr>
+          <w:rFonts w:ascii="Arial" w:eastAsia="Times New Roman" w:hAnsi="Arial" w:cs="Arial"/>
+          <w:kern w:val="0"/>
+          <w:lang w:eastAsia="pt-BR"/>
+          <w14:ligatures w14:val="none"/>
+        </w:rPr>
+        <w:t>responder aos questionários e ver sua pontuação final.</w:t>
       </w:r>
     </w:p>
     <w:p>
@@ -1267,6 +1630,228 @@
     </w:p>
     <w:p>
       <w:pPr>
+        <w:spacing w:before="100" w:beforeAutospacing="1" w:after="100" w:afterAutospacing="1" w:line="240" w:lineRule="auto"/>
+        <w:rPr>
+          <w:rFonts w:ascii="Arial" w:eastAsia="Times New Roman" w:hAnsi="Arial" w:cs="Arial"/>
+          <w:kern w:val="0"/>
+          <w:lang w:eastAsia="pt-BR"/>
+          <w14:ligatures w14:val="none"/>
+        </w:rPr>
+      </w:pPr>
+      <w:r>
+        <w:rPr>
+          <w:rFonts w:ascii="Arial" w:eastAsia="Times New Roman" w:hAnsi="Arial" w:cs="Arial"/>
+          <w:kern w:val="0"/>
+          <w:lang w:eastAsia="pt-BR"/>
+          <w14:ligatures w14:val="none"/>
+        </w:rPr>
+        <w:t>Módulo de Verificação de Curso:</w:t>
+      </w:r>
+    </w:p>
+    <w:p>
+      <w:pPr>
+        <w:numPr>
+          <w:ilvl w:val="0"/>
+          <w:numId w:val="5"/>
+        </w:numPr>
+        <w:spacing w:before="100" w:beforeAutospacing="1" w:after="100" w:afterAutospacing="1" w:line="240" w:lineRule="auto"/>
+        <w:rPr>
+          <w:rFonts w:ascii="Arial" w:eastAsia="Times New Roman" w:hAnsi="Arial" w:cs="Arial"/>
+          <w:kern w:val="0"/>
+          <w:lang w:eastAsia="pt-BR"/>
+          <w14:ligatures w14:val="none"/>
+        </w:rPr>
+      </w:pPr>
+      <w:r>
+        <w:rPr>
+          <w:rFonts w:ascii="Arial" w:eastAsia="Times New Roman" w:hAnsi="Arial" w:cs="Arial"/>
+          <w:b/>
+          <w:bCs/>
+          <w:kern w:val="0"/>
+          <w:lang w:eastAsia="pt-BR"/>
+          <w14:ligatures w14:val="none"/>
+        </w:rPr>
+        <w:t>RF2</w:t>
+      </w:r>
+      <w:r>
+        <w:rPr>
+          <w:rFonts w:ascii="Arial" w:eastAsia="Times New Roman" w:hAnsi="Arial" w:cs="Arial"/>
+          <w:b/>
+          <w:bCs/>
+          <w:kern w:val="0"/>
+          <w:lang w:eastAsia="pt-BR"/>
+          <w14:ligatures w14:val="none"/>
+        </w:rPr>
+        <w:t>2</w:t>
+      </w:r>
+      <w:r>
+        <w:rPr>
+          <w:rFonts w:ascii="Arial" w:eastAsia="Times New Roman" w:hAnsi="Arial" w:cs="Arial"/>
+          <w:b/>
+          <w:bCs/>
+          <w:kern w:val="0"/>
+          <w:lang w:eastAsia="pt-BR"/>
+          <w14:ligatures w14:val="none"/>
+        </w:rPr>
+        <w:t>:</w:t>
+      </w:r>
+      <w:r>
+        <w:rPr>
+          <w:rFonts w:ascii="Arial" w:eastAsia="Times New Roman" w:hAnsi="Arial" w:cs="Arial"/>
+          <w:kern w:val="0"/>
+          <w:lang w:eastAsia="pt-BR"/>
+          <w14:ligatures w14:val="none"/>
+        </w:rPr>
+        <w:t xml:space="preserve"> O sistema deve </w:t>
+      </w:r>
+      <w:r>
+        <w:rPr>
+          <w:rFonts w:ascii="Arial" w:eastAsia="Times New Roman" w:hAnsi="Arial" w:cs="Arial"/>
+          <w:kern w:val="0"/>
+          <w:lang w:eastAsia="pt-BR"/>
+          <w14:ligatures w14:val="none"/>
+        </w:rPr>
+        <w:t xml:space="preserve">ter um administrador que checará a veracidade e completude do curso antes de sua publicação. </w:t>
+      </w:r>
+    </w:p>
+    <w:p>
+      <w:pPr>
+        <w:numPr>
+          <w:ilvl w:val="0"/>
+          <w:numId w:val="5"/>
+        </w:numPr>
+        <w:spacing w:before="100" w:beforeAutospacing="1" w:after="100" w:afterAutospacing="1" w:line="240" w:lineRule="auto"/>
+        <w:rPr>
+          <w:rFonts w:ascii="Arial" w:eastAsia="Times New Roman" w:hAnsi="Arial" w:cs="Arial"/>
+          <w:kern w:val="0"/>
+          <w:lang w:eastAsia="pt-BR"/>
+          <w14:ligatures w14:val="none"/>
+        </w:rPr>
+      </w:pPr>
+      <w:r>
+        <w:rPr>
+          <w:rFonts w:ascii="Arial" w:eastAsia="Times New Roman" w:hAnsi="Arial" w:cs="Arial"/>
+          <w:b/>
+          <w:bCs/>
+          <w:kern w:val="0"/>
+          <w:lang w:eastAsia="pt-BR"/>
+          <w14:ligatures w14:val="none"/>
+        </w:rPr>
+        <w:t>RF2</w:t>
+      </w:r>
+      <w:r>
+        <w:rPr>
+          <w:rFonts w:ascii="Arial" w:eastAsia="Times New Roman" w:hAnsi="Arial" w:cs="Arial"/>
+          <w:b/>
+          <w:bCs/>
+          <w:kern w:val="0"/>
+          <w:lang w:eastAsia="pt-BR"/>
+          <w14:ligatures w14:val="none"/>
+        </w:rPr>
+        <w:t xml:space="preserve">3: </w:t>
+      </w:r>
+      <w:r>
+        <w:rPr>
+          <w:rFonts w:ascii="Arial" w:eastAsia="Times New Roman" w:hAnsi="Arial" w:cs="Arial"/>
+          <w:kern w:val="0"/>
+          <w:lang w:eastAsia="pt-BR"/>
+          <w14:ligatures w14:val="none"/>
+        </w:rPr>
+        <w:t xml:space="preserve">O sistema deve fornecer ao administrador a capacidade de deixar comentários para o instrutor para a melhoria do curso. </w:t>
+      </w:r>
+    </w:p>
+    <w:p>
+      <w:pPr>
+        <w:numPr>
+          <w:ilvl w:val="0"/>
+          <w:numId w:val="5"/>
+        </w:numPr>
+        <w:spacing w:before="100" w:beforeAutospacing="1" w:after="100" w:afterAutospacing="1" w:line="240" w:lineRule="auto"/>
+        <w:rPr>
+          <w:rFonts w:ascii="Arial" w:eastAsia="Times New Roman" w:hAnsi="Arial" w:cs="Arial"/>
+          <w:kern w:val="0"/>
+          <w:lang w:eastAsia="pt-BR"/>
+          <w14:ligatures w14:val="none"/>
+        </w:rPr>
+      </w:pPr>
+      <w:r>
+        <w:rPr>
+          <w:rFonts w:ascii="Arial" w:eastAsia="Times New Roman" w:hAnsi="Arial" w:cs="Arial"/>
+          <w:b/>
+          <w:bCs/>
+          <w:kern w:val="0"/>
+          <w:lang w:eastAsia="pt-BR"/>
+          <w14:ligatures w14:val="none"/>
+        </w:rPr>
+        <w:t>RF24:</w:t>
+      </w:r>
+      <w:r>
+        <w:rPr>
+          <w:rFonts w:ascii="Arial" w:eastAsia="Times New Roman" w:hAnsi="Arial" w:cs="Arial"/>
+          <w:kern w:val="0"/>
+          <w:lang w:eastAsia="pt-BR"/>
+          <w14:ligatures w14:val="none"/>
+        </w:rPr>
+        <w:t xml:space="preserve"> O sistema deve fornecer um checklist para o administrador com perguntas formadas previamente, para que o administrador </w:t>
+      </w:r>
+      <w:proofErr w:type="gramStart"/>
+      <w:r>
+        <w:rPr>
+          <w:rFonts w:ascii="Arial" w:eastAsia="Times New Roman" w:hAnsi="Arial" w:cs="Arial"/>
+          <w:kern w:val="0"/>
+          <w:lang w:eastAsia="pt-BR"/>
+          <w14:ligatures w14:val="none"/>
+        </w:rPr>
+        <w:t>preencha-o</w:t>
+      </w:r>
+      <w:proofErr w:type="gramEnd"/>
+      <w:r>
+        <w:rPr>
+          <w:rFonts w:ascii="Arial" w:eastAsia="Times New Roman" w:hAnsi="Arial" w:cs="Arial"/>
+          <w:kern w:val="0"/>
+          <w:lang w:eastAsia="pt-BR"/>
+          <w14:ligatures w14:val="none"/>
+        </w:rPr>
+        <w:t xml:space="preserve"> e aprove ou não aprove o curso. </w:t>
+      </w:r>
+    </w:p>
+    <w:p>
+      <w:pPr>
+        <w:numPr>
+          <w:ilvl w:val="0"/>
+          <w:numId w:val="5"/>
+        </w:numPr>
+        <w:spacing w:before="100" w:beforeAutospacing="1" w:after="100" w:afterAutospacing="1" w:line="240" w:lineRule="auto"/>
+        <w:rPr>
+          <w:rFonts w:ascii="Arial" w:eastAsia="Times New Roman" w:hAnsi="Arial" w:cs="Arial"/>
+          <w:kern w:val="0"/>
+          <w:lang w:eastAsia="pt-BR"/>
+          <w14:ligatures w14:val="none"/>
+        </w:rPr>
+      </w:pPr>
+      <w:r>
+        <w:rPr>
+          <w:rFonts w:ascii="Arial" w:eastAsia="Times New Roman" w:hAnsi="Arial" w:cs="Arial"/>
+          <w:b/>
+          <w:bCs/>
+          <w:kern w:val="0"/>
+          <w:lang w:eastAsia="pt-BR"/>
+          <w14:ligatures w14:val="none"/>
+        </w:rPr>
+        <w:t>RF25:</w:t>
+      </w:r>
+      <w:r>
+        <w:rPr>
+          <w:rFonts w:ascii="Arial" w:eastAsia="Times New Roman" w:hAnsi="Arial" w:cs="Arial"/>
+          <w:kern w:val="0"/>
+          <w:lang w:eastAsia="pt-BR"/>
+          <w14:ligatures w14:val="none"/>
+        </w:rPr>
+        <w:t xml:space="preserve"> O sistema deve bloquear o lançamento do curso caso o administrador não aprove o curso.</w:t>
+      </w:r>
+    </w:p>
+    <w:p>
+      <w:pPr>
         <w:spacing w:after="0" w:line="240" w:lineRule="auto"/>
         <w:rPr>
           <w:rFonts w:ascii="Arial" w:eastAsia="Times New Roman" w:hAnsi="Arial" w:cs="Arial"/>
@@ -1338,6 +1923,7 @@
           <w:lang w:eastAsia="pt-BR"/>
           <w14:ligatures w14:val="none"/>
         </w:rPr>
+        <w:lastRenderedPageBreak/>
         <w:t>Breve Descrição do Diagrama</w:t>
       </w:r>
     </w:p>
@@ -1577,7 +2163,6 @@
           <w:lang w:eastAsia="pt-BR"/>
           <w14:ligatures w14:val="none"/>
         </w:rPr>
-        <w:lastRenderedPageBreak/>
         <w:t>UserAuthenticationController</w:t>
       </w:r>
       <w:proofErr w:type="spellEnd"/>
@@ -2232,7 +2817,17 @@
           <w:lang w:eastAsia="pt-BR"/>
           <w14:ligatures w14:val="none"/>
         </w:rPr>
-        <w:t xml:space="preserve"> Garantir que todos os 21 requisitos funcionais fossem cobertos pela interação dos 32 componentes do diagrama foi um processo meticuloso. É fácil perder de vista um requisito ou criar um componente que não serve a um propósito funcional claro. Foi preciso revisitar a lista de requisitos constantemente durante a modelagem para garantir que a arquitetura proposta realmente suportaria todas as funcionalidades esperadas.</w:t>
+        <w:t xml:space="preserve"> Garantir que todos os 21 requisitos funcionais fossem cobertos pela interação dos 32 componentes do diagrama foi um processo meticuloso. É fácil perder de </w:t>
+      </w:r>
+      <w:r>
+        <w:rPr>
+          <w:rFonts w:ascii="Arial" w:eastAsia="Times New Roman" w:hAnsi="Arial" w:cs="Arial"/>
+          <w:kern w:val="0"/>
+          <w:lang w:eastAsia="pt-BR"/>
+          <w14:ligatures w14:val="none"/>
+        </w:rPr>
+        <w:lastRenderedPageBreak/>
+        <w:t>vista um requisito ou criar um componente que não serve a um propósito funcional claro. Foi preciso revisitar a lista de requisitos constantemente durante a modelagem para garantir que a arquitetura proposta realmente suportaria todas as funcionalidades esperadas.</w:t>
       </w:r>
     </w:p>
     <w:p>
@@ -2312,7 +2907,6 @@
           <w:lang w:eastAsia="pt-BR"/>
           <w14:ligatures w14:val="none"/>
         </w:rPr>
-        <w:lastRenderedPageBreak/>
         <w:t>Uso de IA Generativa na Elaboração do Projeto</w:t>
       </w:r>
     </w:p>
@@ -2452,19 +3046,7 @@
         <w:rPr>
           <w:rFonts w:ascii="Arial" w:hAnsi="Arial" w:cs="Arial"/>
         </w:rPr>
-        <w:t xml:space="preserve"> Por fim, a IA foi utilizada como uma assistente de redação para </w:t>
-      </w:r>
-      <w:r>
-        <w:rPr>
-          <w:rFonts w:ascii="Arial" w:hAnsi="Arial" w:cs="Arial"/>
-        </w:rPr>
-        <w:t>refinar e aprimorar</w:t>
-      </w:r>
-      <w:r>
-        <w:rPr>
-          <w:rFonts w:ascii="Arial" w:hAnsi="Arial" w:cs="Arial"/>
-        </w:rPr>
-        <w:t xml:space="preserve"> os textos descritivos do projeto, como o contexto, a descrição do diagrama e a reflexão sobre as dificuldades</w:t>
+        <w:t xml:space="preserve"> Por fim, a IA foi utilizada como uma assistente de redação para refinar e aprimorar os textos descritivos do projeto, como o contexto, a descrição do diagrama e a reflexão sobre as dificuldades</w:t>
       </w:r>
     </w:p>
     <w:p>
@@ -2744,6 +3326,7 @@
           <w:lang w:eastAsia="pt-BR"/>
           <w14:ligatures w14:val="none"/>
         </w:rPr>
+        <w:lastRenderedPageBreak/>
         <w:t xml:space="preserve">Antes de desenhar, leia a lista de ~20 requisitos e agrupe-os por afinidade para revelar as grandes áreas do seu sistema (Usuários, Cursos, </w:t>
       </w:r>
       <w:proofErr w:type="gramStart"/>
@@ -2940,7 +3523,6 @@
           <w:lang w:eastAsia="pt-BR"/>
           <w14:ligatures w14:val="none"/>
         </w:rPr>
-        <w:lastRenderedPageBreak/>
         <w:t xml:space="preserve">Para cada pacote, pense nos "blocos de construção" (componentes) necessários para executar os requisitos daquele grupo. </w:t>
       </w:r>
       <w:proofErr w:type="gramStart"/>

</xml_diff>